<commit_message>
Update dashboard and project documentation
</commit_message>
<xml_diff>
--- a/Student_performance_analysis/Project_Documentation.docx
+++ b/Student_performance_analysis/Project_Documentation.docx
@@ -167,7 +167,7 @@
         <w:spacing w:after="120"/>
       </w:pPr>
       <w:r>
-        <w:t>The dataset is stored in students.csv and contains 25 student records. Marks are out of 100 and attendance is a percentage.</w:t>
+        <w:t>The dataset is stored in students_data.csv and contains 25 student records. Marks are out of 100 and attendance is a percentage.</w:t>
       </w:r>
     </w:p>
     <w:tbl>
@@ -665,16 +665,12 @@
         </w:numPr>
       </w:pPr>
       <w:r>
-        <w:t xml:space="preserve">Data loading: </w:t>
-      </w:r>
-      <w:proofErr w:type="spellStart"/>
-      <w:r>
-        <w:t>pandas.read_csv</w:t>
-      </w:r>
-      <w:proofErr w:type="spellEnd"/>
-      <w:r>
-        <w:t>() loads students.csv into a DataFrame. A try/except block shows a friendly message if the file is missing. The data, number of students and column names are displayed.</w:t>
-      </w:r>
+        <w:t>Data loading: pandas.read_csv() loads students_data.csv into a DataFrame. A try/except block shows a friendly message if the file is missing. The data, number of students and column names are displayed.</w:t>
+      </w:r>
+      <w:proofErr w:type="spellStart"/>
+      <w:r/>
+      <w:proofErr w:type="spellEnd"/>
+      <w:r/>
     </w:p>
     <w:p>
       <w:pPr>
@@ -737,16 +733,12 @@
         </w:numPr>
       </w:pPr>
       <w:r>
-        <w:t xml:space="preserve">Pass/fail rule: the pass mark is 40 in each subject. A student passes overall only when all three subjects are passed. NumPy's </w:t>
-      </w:r>
-      <w:proofErr w:type="spellStart"/>
-      <w:r>
-        <w:t>np.where</w:t>
-      </w:r>
-      <w:proofErr w:type="spellEnd"/>
-      <w:r>
-        <w:t>() applies this condition across all students.</w:t>
-      </w:r>
+        <w:t>Pass/fail rule: the pass mark is 35 in each subject, as defined by PASS_MARK in functions.py. A student passes overall only when all three subjects have marks of at least 35. NumPy's np.where() applies this condition across all students.</w:t>
+      </w:r>
+      <w:proofErr w:type="spellStart"/>
+      <w:r/>
+      <w:proofErr w:type="spellEnd"/>
+      <w:r/>
     </w:p>
     <w:p>
       <w:pPr>
@@ -757,8 +749,7 @@
         </w:numPr>
       </w:pPr>
       <w:r>
-        <w:lastRenderedPageBreak/>
-        <w:t>Grading rule: A+ (90 and above), A (80-89), B (70-79), C (60-69), D (50-59), E (40-49), F (below 40), based on the average marks.</w:t>
+        <w:t>Grading rule based on average marks: S (90 and above), A (80 to below 90), B (70 to below 80), C (60 to below 70), D (50 to below 60), E (35 to below 50), and F (below 35).</w:t>
       </w:r>
     </w:p>
     <w:p>
@@ -894,7 +885,7 @@
         </w:numPr>
       </w:pPr>
       <w:r>
-        <w:t>Reads and validates a CSV dataset with Pandas</w:t>
+        <w:t>Reads a CSV dataset with Pandas</w:t>
       </w:r>
     </w:p>
     <w:p>
@@ -2568,7 +2559,7 @@
         <w:spacing w:after="120"/>
       </w:pPr>
       <w:r>
-        <w:t>The project runs successfully and produces a clear, complete analysis of 25 students. Results: class average 67.76; highest average 91.33 (P Keerthi); lowest average 36.67 (K Arjun and P Hasini); 18 students passed and 7 failed; English is the best-performing subject (average 74.80) and Maths the weakest (61.28). The top three students are P Keerthi, Yashwanth MK and A Hanipriya. All required features of the assignment were implemented.</w:t>
+        <w:t>The project runs successfully and produces a clear analysis of 25 students. Results: class average 67.76; highest average 91.33 (P Keerthi); lowest average 36.67 (K Arjun and P Hasini); 19 students passed and 6 failed. English is the best-performing subject (average 74.80), while Maths has the lowest subject average (61.28). The top three students are P Keerthi, Yashwanth MK and A Hanipriya. The implemented features include totals, averages, grades, subject-wise and overall results, attendance statistics, department-wise analysis, and top-student ranking.</w:t>
       </w:r>
     </w:p>
     <w:p>
@@ -2588,7 +2579,7 @@
         </w:numPr>
       </w:pPr>
       <w:r>
-        <w:t>Challenge: some rows in students.csv were missing the Department value, which shifted the columns and gave wrong marks for 11 students. Solution: I found the problem by inspecting the DataFrame, then corrected the CSV so every row has all 7 columns. Learning: always inspect data after loading it.</w:t>
+        <w:t>Challenge: some rows in the original dataset were missing the Department value, which shifted columns and caused incorrect marks for some students. Solution: I inspected the DataFrame and corrected the CSV so every row contains all 7 required columns. Learning: always inspect data after loading it.</w:t>
       </w:r>
     </w:p>
     <w:p>
@@ -2628,7 +2619,7 @@
         </w:numPr>
       </w:pPr>
       <w:r>
-        <w:t>Challenge: the pass mark was inconsistent (35 in one place, 40 in another). Solution: defined a single PASS_MARK constant in functions.py and used it everywhere. Learning: keep rules in one place.</w:t>
+        <w:t>Challenge: the pass mark had been inconsistent (35 in one place, 40 in another). Solution: the project uses the single PASS_MARK = 35 constant defined in functions.py. Learning: keep rules in one place.</w:t>
       </w:r>
     </w:p>
     <w:p>

</xml_diff>